<commit_message>
Deploying website to gh-pages
</commit_message>
<xml_diff>
--- a/slides/medmod2/PROCESS_Models_7_8_59_v2.docx
+++ b/slides/medmod2/PROCESS_Models_7_8_59_v2.docx
@@ -4,7 +4,6 @@
   <w:body>
     <w:p>
       <w:pPr>
-        <w:shd w:val="clear" w:color="auto" w:fill="1A2744"/>
         <w:spacing w:before="480"/>
         <w:jc w:val="center"/>
       </w:pPr>
@@ -12,7 +11,6 @@
         <w:rPr>
           <w:b/>
           <w:bCs/>
-          <w:color w:val="FFFFFF"/>
           <w:sz w:val="52"/>
           <w:szCs w:val="52"/>
         </w:rPr>
@@ -21,31 +19,14 @@
     </w:p>
     <w:p>
       <w:pPr>
-        <w:shd w:val="clear" w:color="auto" w:fill="1A2744"/>
         <w:jc w:val="center"/>
       </w:pPr>
       <w:r>
         <w:rPr>
           <w:i/>
           <w:iCs/>
-          <w:color w:val="A8BCDB"/>
         </w:rPr>
         <w:t>Conditional Process Analysis — Worked Examples with PROCESS Output, Conceptual &amp; Statistical Diagrams, Full Interpretations, and APA Write-Ups</w:t>
-      </w:r>
-    </w:p>
-    <w:p>
-      <w:pPr>
-        <w:shd w:val="clear" w:color="auto" w:fill="1A2744"/>
-        <w:spacing w:after="480"/>
-        <w:jc w:val="center"/>
-      </w:pPr>
-      <w:r>
-        <w:rPr>
-          <w:color w:val="6B91B8"/>
-          <w:sz w:val="20"/>
-          <w:szCs w:val="20"/>
-        </w:rPr>
-        <w:t>For PhD Teaching and Research Reference</w:t>
       </w:r>
     </w:p>
     <w:p>
@@ -427,7 +408,6 @@
     </w:p>
     <w:p>
       <w:pPr>
-        <w:shd w:val="clear" w:color="auto" w:fill="1A2744"/>
         <w:spacing w:before="240"/>
         <w:jc w:val="center"/>
       </w:pPr>
@@ -435,7 +415,6 @@
         <w:rPr>
           <w:b/>
           <w:bCs/>
-          <w:color w:val="FFFFFF"/>
           <w:sz w:val="44"/>
           <w:szCs w:val="44"/>
         </w:rPr>
@@ -445,7 +424,6 @@
     </w:p>
     <w:p>
       <w:pPr>
-        <w:shd w:val="clear" w:color="auto" w:fill="1A2744"/>
         <w:spacing w:after="400"/>
         <w:jc w:val="center"/>
       </w:pPr>
@@ -453,7 +431,6 @@
         <w:rPr>
           <w:i/>
           <w:iCs/>
-          <w:color w:val="A8BCDB"/>
         </w:rPr>
         <w:t>First-Stage Moderated Mediation — W moderates the a-path only</w:t>
       </w:r>
@@ -511,49 +488,6 @@
         <w:spacing w:before="80" w:after="80"/>
         <w:jc w:val="center"/>
       </w:pPr>
-      <w:r>
-        <w:rPr>
-          <w:noProof/>
-        </w:rPr>
-        <w:drawing>
-          <wp:inline distT="0" distB="0" distL="0" distR="0" wp14:anchorId="1C91E41F" wp14:editId="23E92D1D">
-            <wp:extent cx="4572000" cy="1438275"/>
-            <wp:effectExtent l="0" t="0" r="0" b="0"/>
-            <wp:docPr id="1" name="diagram" descr="Path diagram" title="Diagram"/>
-            <wp:cNvGraphicFramePr>
-              <a:graphicFrameLocks xmlns:a="http://schemas.openxmlformats.org/drawingml/2006/main" noChangeAspect="1"/>
-            </wp:cNvGraphicFramePr>
-            <a:graphic xmlns:a="http://schemas.openxmlformats.org/drawingml/2006/main">
-              <a:graphicData uri="http://schemas.openxmlformats.org/drawingml/2006/picture">
-                <pic:pic xmlns:pic="http://schemas.openxmlformats.org/drawingml/2006/picture">
-                  <pic:nvPicPr>
-                    <pic:cNvPr id="0" name=""/>
-                    <pic:cNvPicPr>
-                      <a:picLocks noChangeAspect="1" noChangeArrowheads="1"/>
-                    </pic:cNvPicPr>
-                  </pic:nvPicPr>
-                  <pic:blipFill>
-                    <a:blip r:embed="rId5"/>
-                    <a:srcRect/>
-                    <a:stretch>
-                      <a:fillRect/>
-                    </a:stretch>
-                  </pic:blipFill>
-                  <pic:spPr bwMode="auto">
-                    <a:xfrm>
-                      <a:off x="0" y="0"/>
-                      <a:ext cx="4572000" cy="1438275"/>
-                    </a:xfrm>
-                    <a:prstGeom prst="rect">
-                      <a:avLst/>
-                    </a:prstGeom>
-                  </pic:spPr>
-                </pic:pic>
-              </a:graphicData>
-            </a:graphic>
-          </wp:inline>
-        </w:drawing>
-      </w:r>
     </w:p>
     <w:p>
       <w:pPr>
@@ -584,49 +518,6 @@
         <w:spacing w:before="80" w:after="80"/>
         <w:jc w:val="center"/>
       </w:pPr>
-      <w:r>
-        <w:rPr>
-          <w:noProof/>
-        </w:rPr>
-        <w:drawing>
-          <wp:inline distT="0" distB="0" distL="0" distR="0" wp14:anchorId="43747FAF" wp14:editId="675347B8">
-            <wp:extent cx="4572000" cy="1695450"/>
-            <wp:effectExtent l="0" t="0" r="0" b="0"/>
-            <wp:docPr id="1974821372" name="diagram" descr="Path diagram" title="Diagram"/>
-            <wp:cNvGraphicFramePr>
-              <a:graphicFrameLocks xmlns:a="http://schemas.openxmlformats.org/drawingml/2006/main" noChangeAspect="1"/>
-            </wp:cNvGraphicFramePr>
-            <a:graphic xmlns:a="http://schemas.openxmlformats.org/drawingml/2006/main">
-              <a:graphicData uri="http://schemas.openxmlformats.org/drawingml/2006/picture">
-                <pic:pic xmlns:pic="http://schemas.openxmlformats.org/drawingml/2006/picture">
-                  <pic:nvPicPr>
-                    <pic:cNvPr id="0" name=""/>
-                    <pic:cNvPicPr>
-                      <a:picLocks noChangeAspect="1" noChangeArrowheads="1"/>
-                    </pic:cNvPicPr>
-                  </pic:nvPicPr>
-                  <pic:blipFill>
-                    <a:blip r:embed="rId6"/>
-                    <a:srcRect/>
-                    <a:stretch>
-                      <a:fillRect/>
-                    </a:stretch>
-                  </pic:blipFill>
-                  <pic:spPr bwMode="auto">
-                    <a:xfrm>
-                      <a:off x="0" y="0"/>
-                      <a:ext cx="4572000" cy="1695450"/>
-                    </a:xfrm>
-                    <a:prstGeom prst="rect">
-                      <a:avLst/>
-                    </a:prstGeom>
-                  </pic:spPr>
-                </pic:pic>
-              </a:graphicData>
-            </a:graphic>
-          </wp:inline>
-        </w:drawing>
-      </w:r>
     </w:p>
     <w:p>
       <w:pPr>
@@ -3203,49 +3094,6 @@
         <w:spacing w:before="80" w:after="80"/>
         <w:jc w:val="center"/>
       </w:pPr>
-      <w:r>
-        <w:rPr>
-          <w:noProof/>
-        </w:rPr>
-        <w:drawing>
-          <wp:inline distT="0" distB="0" distL="0" distR="0" wp14:anchorId="00F3544F" wp14:editId="11F614D9">
-            <wp:extent cx="4572000" cy="1438275"/>
-            <wp:effectExtent l="0" t="0" r="0" b="0"/>
-            <wp:docPr id="1729052422" name="diagram" descr="Path diagram" title="Diagram"/>
-            <wp:cNvGraphicFramePr>
-              <a:graphicFrameLocks xmlns:a="http://schemas.openxmlformats.org/drawingml/2006/main" noChangeAspect="1"/>
-            </wp:cNvGraphicFramePr>
-            <a:graphic xmlns:a="http://schemas.openxmlformats.org/drawingml/2006/main">
-              <a:graphicData uri="http://schemas.openxmlformats.org/drawingml/2006/picture">
-                <pic:pic xmlns:pic="http://schemas.openxmlformats.org/drawingml/2006/picture">
-                  <pic:nvPicPr>
-                    <pic:cNvPr id="0" name=""/>
-                    <pic:cNvPicPr>
-                      <a:picLocks noChangeAspect="1" noChangeArrowheads="1"/>
-                    </pic:cNvPicPr>
-                  </pic:nvPicPr>
-                  <pic:blipFill>
-                    <a:blip r:embed="rId5"/>
-                    <a:srcRect/>
-                    <a:stretch>
-                      <a:fillRect/>
-                    </a:stretch>
-                  </pic:blipFill>
-                  <pic:spPr bwMode="auto">
-                    <a:xfrm>
-                      <a:off x="0" y="0"/>
-                      <a:ext cx="4572000" cy="1438275"/>
-                    </a:xfrm>
-                    <a:prstGeom prst="rect">
-                      <a:avLst/>
-                    </a:prstGeom>
-                  </pic:spPr>
-                </pic:pic>
-              </a:graphicData>
-            </a:graphic>
-          </wp:inline>
-        </w:drawing>
-      </w:r>
     </w:p>
     <w:p>
       <w:pPr>
@@ -3276,48 +3124,13 @@
         <w:spacing w:before="80" w:after="80"/>
         <w:jc w:val="center"/>
       </w:pPr>
-      <w:r>
-        <w:rPr>
-          <w:noProof/>
-        </w:rPr>
-        <w:drawing>
-          <wp:inline distT="0" distB="0" distL="0" distR="0" wp14:anchorId="288A7A83" wp14:editId="638AC2F9">
-            <wp:extent cx="4572000" cy="1695450"/>
-            <wp:effectExtent l="0" t="0" r="0" b="0"/>
-            <wp:docPr id="56050287" name="diagram" descr="Path diagram" title="Diagram"/>
-            <wp:cNvGraphicFramePr>
-              <a:graphicFrameLocks xmlns:a="http://schemas.openxmlformats.org/drawingml/2006/main" noChangeAspect="1"/>
-            </wp:cNvGraphicFramePr>
-            <a:graphic xmlns:a="http://schemas.openxmlformats.org/drawingml/2006/main">
-              <a:graphicData uri="http://schemas.openxmlformats.org/drawingml/2006/picture">
-                <pic:pic xmlns:pic="http://schemas.openxmlformats.org/drawingml/2006/picture">
-                  <pic:nvPicPr>
-                    <pic:cNvPr id="0" name=""/>
-                    <pic:cNvPicPr>
-                      <a:picLocks noChangeAspect="1" noChangeArrowheads="1"/>
-                    </pic:cNvPicPr>
-                  </pic:nvPicPr>
-                  <pic:blipFill>
-                    <a:blip r:embed="rId6"/>
-                    <a:srcRect/>
-                    <a:stretch>
-                      <a:fillRect/>
-                    </a:stretch>
-                  </pic:blipFill>
-                  <pic:spPr bwMode="auto">
-                    <a:xfrm>
-                      <a:off x="0" y="0"/>
-                      <a:ext cx="4572000" cy="1695450"/>
-                    </a:xfrm>
-                    <a:prstGeom prst="rect">
-                      <a:avLst/>
-                    </a:prstGeom>
-                  </pic:spPr>
-                </pic:pic>
-              </a:graphicData>
-            </a:graphic>
-          </wp:inline>
-        </w:drawing>
+    </w:p>
+    <w:p>
+      <w:pPr>
+        <w:spacing w:before="80" w:after="80"/>
+      </w:pPr>
+      <w:r>
+        <w:t>Note this model has sex or support for W for the separate examples.</w:t>
       </w:r>
     </w:p>
     <w:p>
@@ -6023,13 +5836,7 @@
       </w:pPr>
     </w:p>
     <w:p>
-      <w:r>
-        <w:br w:type="page"/>
-      </w:r>
-    </w:p>
-    <w:p>
-      <w:pPr>
-        <w:shd w:val="clear" w:color="auto" w:fill="1A2744"/>
+      <w:pPr>
         <w:spacing w:before="240"/>
         <w:jc w:val="center"/>
       </w:pPr>
@@ -6037,7 +5844,6 @@
         <w:rPr>
           <w:b/>
           <w:bCs/>
-          <w:color w:val="FFFFFF"/>
           <w:sz w:val="44"/>
           <w:szCs w:val="44"/>
         </w:rPr>
@@ -6046,7 +5852,6 @@
     </w:p>
     <w:p>
       <w:pPr>
-        <w:shd w:val="clear" w:color="auto" w:fill="1A2744"/>
         <w:spacing w:after="400"/>
         <w:jc w:val="center"/>
       </w:pPr>
@@ -6054,7 +5859,6 @@
         <w:rPr>
           <w:i/>
           <w:iCs/>
-          <w:color w:val="A8BCDB"/>
         </w:rPr>
         <w:t>Dual-Path Moderated Mediation — W moderates a-path AND c'-path</w:t>
       </w:r>
@@ -6120,49 +5924,6 @@
         <w:spacing w:before="80" w:after="80"/>
         <w:jc w:val="center"/>
       </w:pPr>
-      <w:r>
-        <w:rPr>
-          <w:noProof/>
-        </w:rPr>
-        <w:drawing>
-          <wp:inline distT="0" distB="0" distL="0" distR="0" wp14:anchorId="5D66C8AC" wp14:editId="4B2D5A88">
-            <wp:extent cx="4572000" cy="1504950"/>
-            <wp:effectExtent l="0" t="0" r="0" b="0"/>
-            <wp:docPr id="1556766170" name="diagram" descr="Path diagram" title="Diagram"/>
-            <wp:cNvGraphicFramePr>
-              <a:graphicFrameLocks xmlns:a="http://schemas.openxmlformats.org/drawingml/2006/main" noChangeAspect="1"/>
-            </wp:cNvGraphicFramePr>
-            <a:graphic xmlns:a="http://schemas.openxmlformats.org/drawingml/2006/main">
-              <a:graphicData uri="http://schemas.openxmlformats.org/drawingml/2006/picture">
-                <pic:pic xmlns:pic="http://schemas.openxmlformats.org/drawingml/2006/picture">
-                  <pic:nvPicPr>
-                    <pic:cNvPr id="0" name=""/>
-                    <pic:cNvPicPr>
-                      <a:picLocks noChangeAspect="1" noChangeArrowheads="1"/>
-                    </pic:cNvPicPr>
-                  </pic:nvPicPr>
-                  <pic:blipFill>
-                    <a:blip r:embed="rId7"/>
-                    <a:srcRect/>
-                    <a:stretch>
-                      <a:fillRect/>
-                    </a:stretch>
-                  </pic:blipFill>
-                  <pic:spPr bwMode="auto">
-                    <a:xfrm>
-                      <a:off x="0" y="0"/>
-                      <a:ext cx="4572000" cy="1504950"/>
-                    </a:xfrm>
-                    <a:prstGeom prst="rect">
-                      <a:avLst/>
-                    </a:prstGeom>
-                  </pic:spPr>
-                </pic:pic>
-              </a:graphicData>
-            </a:graphic>
-          </wp:inline>
-        </w:drawing>
-      </w:r>
     </w:p>
     <w:p>
       <w:pPr>
@@ -6201,49 +5962,6 @@
         <w:spacing w:before="80" w:after="80"/>
         <w:jc w:val="center"/>
       </w:pPr>
-      <w:r>
-        <w:rPr>
-          <w:noProof/>
-        </w:rPr>
-        <w:drawing>
-          <wp:inline distT="0" distB="0" distL="0" distR="0" wp14:anchorId="25F6EA66" wp14:editId="0C8B207A">
-            <wp:extent cx="4572000" cy="1828800"/>
-            <wp:effectExtent l="0" t="0" r="0" b="0"/>
-            <wp:docPr id="438682237" name="diagram" descr="Path diagram" title="Diagram"/>
-            <wp:cNvGraphicFramePr>
-              <a:graphicFrameLocks xmlns:a="http://schemas.openxmlformats.org/drawingml/2006/main" noChangeAspect="1"/>
-            </wp:cNvGraphicFramePr>
-            <a:graphic xmlns:a="http://schemas.openxmlformats.org/drawingml/2006/main">
-              <a:graphicData uri="http://schemas.openxmlformats.org/drawingml/2006/picture">
-                <pic:pic xmlns:pic="http://schemas.openxmlformats.org/drawingml/2006/picture">
-                  <pic:nvPicPr>
-                    <pic:cNvPr id="0" name=""/>
-                    <pic:cNvPicPr>
-                      <a:picLocks noChangeAspect="1" noChangeArrowheads="1"/>
-                    </pic:cNvPicPr>
-                  </pic:nvPicPr>
-                  <pic:blipFill>
-                    <a:blip r:embed="rId8"/>
-                    <a:srcRect/>
-                    <a:stretch>
-                      <a:fillRect/>
-                    </a:stretch>
-                  </pic:blipFill>
-                  <pic:spPr bwMode="auto">
-                    <a:xfrm>
-                      <a:off x="0" y="0"/>
-                      <a:ext cx="4572000" cy="1828800"/>
-                    </a:xfrm>
-                    <a:prstGeom prst="rect">
-                      <a:avLst/>
-                    </a:prstGeom>
-                  </pic:spPr>
-                </pic:pic>
-              </a:graphicData>
-            </a:graphic>
-          </wp:inline>
-        </w:drawing>
-      </w:r>
     </w:p>
     <w:p>
       <w:pPr>
@@ -8361,15 +8079,16 @@
         <w:spacing w:before="60" w:after="80"/>
       </w:pPr>
       <w:r>
-        <w:t xml:space="preserve">The direct effect of poverty on dropout is significant at all levels of teacher </w:t>
-      </w:r>
-      <w:proofErr w:type="gramStart"/>
-      <w:r>
-        <w:t>quality, but</w:t>
-      </w:r>
-      <w:proofErr w:type="gramEnd"/>
-      <w:r>
-        <w:t xml:space="preserve"> nearly halved from low to high quality teachers (0.383 vs. 0.206). High-quality teachers protect against the direct route as well as the mediated route.</w:t>
+        <w:t>The direct impact of poverty on dropout rates is significant across all levels of teacher quality, but it is nearly cut in half from low to high quality teachers (0.383 vs. 0.206).</w:t>
+      </w:r>
+      <w:r>
+        <w:t xml:space="preserve"> High-quality teachers protect against </w:t>
+      </w:r>
+      <w:r>
+        <w:t>both the direct and mediated routes</w:t>
+      </w:r>
+      <w:r>
+        <w:t>.</w:t>
       </w:r>
     </w:p>
     <w:p>
@@ -9190,49 +8909,6 @@
         <w:spacing w:before="80" w:after="80"/>
         <w:jc w:val="center"/>
       </w:pPr>
-      <w:r>
-        <w:rPr>
-          <w:noProof/>
-        </w:rPr>
-        <w:drawing>
-          <wp:inline distT="0" distB="0" distL="0" distR="0" wp14:anchorId="50699E7E" wp14:editId="7EF22E1F">
-            <wp:extent cx="4572000" cy="1504950"/>
-            <wp:effectExtent l="0" t="0" r="0" b="0"/>
-            <wp:docPr id="145534742" name="diagram" descr="Path diagram" title="Diagram"/>
-            <wp:cNvGraphicFramePr>
-              <a:graphicFrameLocks xmlns:a="http://schemas.openxmlformats.org/drawingml/2006/main" noChangeAspect="1"/>
-            </wp:cNvGraphicFramePr>
-            <a:graphic xmlns:a="http://schemas.openxmlformats.org/drawingml/2006/main">
-              <a:graphicData uri="http://schemas.openxmlformats.org/drawingml/2006/picture">
-                <pic:pic xmlns:pic="http://schemas.openxmlformats.org/drawingml/2006/picture">
-                  <pic:nvPicPr>
-                    <pic:cNvPr id="0" name=""/>
-                    <pic:cNvPicPr>
-                      <a:picLocks noChangeAspect="1" noChangeArrowheads="1"/>
-                    </pic:cNvPicPr>
-                  </pic:nvPicPr>
-                  <pic:blipFill>
-                    <a:blip r:embed="rId7"/>
-                    <a:srcRect/>
-                    <a:stretch>
-                      <a:fillRect/>
-                    </a:stretch>
-                  </pic:blipFill>
-                  <pic:spPr bwMode="auto">
-                    <a:xfrm>
-                      <a:off x="0" y="0"/>
-                      <a:ext cx="4572000" cy="1504950"/>
-                    </a:xfrm>
-                    <a:prstGeom prst="rect">
-                      <a:avLst/>
-                    </a:prstGeom>
-                  </pic:spPr>
-                </pic:pic>
-              </a:graphicData>
-            </a:graphic>
-          </wp:inline>
-        </w:drawing>
-      </w:r>
     </w:p>
     <w:p>
       <w:pPr>
@@ -9272,55 +8948,6 @@
       <w:proofErr w:type="spellEnd"/>
       <w:r>
         <w:t xml:space="preserve"> (Y-equation) conditional paths. Note that b remains constant regardless of W.</w:t>
-      </w:r>
-    </w:p>
-    <w:p>
-      <w:pPr>
-        <w:spacing w:before="80" w:after="80"/>
-        <w:jc w:val="center"/>
-      </w:pPr>
-      <w:r>
-        <w:rPr>
-          <w:noProof/>
-        </w:rPr>
-        <w:drawing>
-          <wp:inline distT="0" distB="0" distL="0" distR="0" wp14:anchorId="2BE0601C" wp14:editId="59D3EDF5">
-            <wp:extent cx="4572000" cy="1828800"/>
-            <wp:effectExtent l="0" t="0" r="0" b="0"/>
-            <wp:docPr id="2136184343" name="diagram" descr="Path diagram" title="Diagram"/>
-            <wp:cNvGraphicFramePr>
-              <a:graphicFrameLocks xmlns:a="http://schemas.openxmlformats.org/drawingml/2006/main" noChangeAspect="1"/>
-            </wp:cNvGraphicFramePr>
-            <a:graphic xmlns:a="http://schemas.openxmlformats.org/drawingml/2006/main">
-              <a:graphicData uri="http://schemas.openxmlformats.org/drawingml/2006/picture">
-                <pic:pic xmlns:pic="http://schemas.openxmlformats.org/drawingml/2006/picture">
-                  <pic:nvPicPr>
-                    <pic:cNvPr id="0" name=""/>
-                    <pic:cNvPicPr>
-                      <a:picLocks noChangeAspect="1" noChangeArrowheads="1"/>
-                    </pic:cNvPicPr>
-                  </pic:nvPicPr>
-                  <pic:blipFill>
-                    <a:blip r:embed="rId8"/>
-                    <a:srcRect/>
-                    <a:stretch>
-                      <a:fillRect/>
-                    </a:stretch>
-                  </pic:blipFill>
-                  <pic:spPr bwMode="auto">
-                    <a:xfrm>
-                      <a:off x="0" y="0"/>
-                      <a:ext cx="4572000" cy="1828800"/>
-                    </a:xfrm>
-                    <a:prstGeom prst="rect">
-                      <a:avLst/>
-                    </a:prstGeom>
-                  </pic:spPr>
-                </pic:pic>
-              </a:graphicData>
-            </a:graphic>
-          </wp:inline>
-        </w:drawing>
       </w:r>
     </w:p>
     <w:p>
@@ -11320,13 +10947,7 @@
       </w:pPr>
     </w:p>
     <w:p>
-      <w:r>
-        <w:br w:type="page"/>
-      </w:r>
-    </w:p>
-    <w:p>
-      <w:pPr>
-        <w:shd w:val="clear" w:color="auto" w:fill="1A2744"/>
+      <w:pPr>
         <w:spacing w:before="240"/>
         <w:jc w:val="center"/>
       </w:pPr>
@@ -11334,7 +10955,6 @@
         <w:rPr>
           <w:b/>
           <w:bCs/>
-          <w:color w:val="FFFFFF"/>
           <w:sz w:val="44"/>
           <w:szCs w:val="44"/>
         </w:rPr>
@@ -11343,7 +10963,6 @@
     </w:p>
     <w:p>
       <w:pPr>
-        <w:shd w:val="clear" w:color="auto" w:fill="1A2744"/>
         <w:spacing w:after="400"/>
         <w:jc w:val="center"/>
       </w:pPr>
@@ -11351,7 +10970,6 @@
         <w:rPr>
           <w:i/>
           <w:iCs/>
-          <w:color w:val="A8BCDB"/>
         </w:rPr>
         <w:t>Full Conditional Process — W moderates all three paths (Quadratic Indirect Effect)</w:t>
       </w:r>
@@ -11417,49 +11035,6 @@
         <w:spacing w:before="80" w:after="80"/>
         <w:jc w:val="center"/>
       </w:pPr>
-      <w:r>
-        <w:rPr>
-          <w:noProof/>
-        </w:rPr>
-        <w:drawing>
-          <wp:inline distT="0" distB="0" distL="0" distR="0" wp14:anchorId="325CBD66" wp14:editId="2ADAD363">
-            <wp:extent cx="4572000" cy="1571625"/>
-            <wp:effectExtent l="0" t="0" r="0" b="0"/>
-            <wp:docPr id="322398077" name="diagram" descr="Path diagram" title="Diagram"/>
-            <wp:cNvGraphicFramePr>
-              <a:graphicFrameLocks xmlns:a="http://schemas.openxmlformats.org/drawingml/2006/main" noChangeAspect="1"/>
-            </wp:cNvGraphicFramePr>
-            <a:graphic xmlns:a="http://schemas.openxmlformats.org/drawingml/2006/main">
-              <a:graphicData uri="http://schemas.openxmlformats.org/drawingml/2006/picture">
-                <pic:pic xmlns:pic="http://schemas.openxmlformats.org/drawingml/2006/picture">
-                  <pic:nvPicPr>
-                    <pic:cNvPr id="0" name=""/>
-                    <pic:cNvPicPr>
-                      <a:picLocks noChangeAspect="1" noChangeArrowheads="1"/>
-                    </pic:cNvPicPr>
-                  </pic:nvPicPr>
-                  <pic:blipFill>
-                    <a:blip r:embed="rId9"/>
-                    <a:srcRect/>
-                    <a:stretch>
-                      <a:fillRect/>
-                    </a:stretch>
-                  </pic:blipFill>
-                  <pic:spPr bwMode="auto">
-                    <a:xfrm>
-                      <a:off x="0" y="0"/>
-                      <a:ext cx="4572000" cy="1571625"/>
-                    </a:xfrm>
-                    <a:prstGeom prst="rect">
-                      <a:avLst/>
-                    </a:prstGeom>
-                  </pic:spPr>
-                </pic:pic>
-              </a:graphicData>
-            </a:graphic>
-          </wp:inline>
-        </w:drawing>
-      </w:r>
     </w:p>
     <w:p>
       <w:pPr>
@@ -11506,49 +11081,6 @@
         <w:spacing w:before="80" w:after="80"/>
         <w:jc w:val="center"/>
       </w:pPr>
-      <w:r>
-        <w:rPr>
-          <w:noProof/>
-        </w:rPr>
-        <w:drawing>
-          <wp:inline distT="0" distB="0" distL="0" distR="0" wp14:anchorId="27EC54EF" wp14:editId="308311BE">
-            <wp:extent cx="4572000" cy="1962150"/>
-            <wp:effectExtent l="0" t="0" r="0" b="0"/>
-            <wp:docPr id="1480413417" name="diagram" descr="Path diagram" title="Diagram"/>
-            <wp:cNvGraphicFramePr>
-              <a:graphicFrameLocks xmlns:a="http://schemas.openxmlformats.org/drawingml/2006/main" noChangeAspect="1"/>
-            </wp:cNvGraphicFramePr>
-            <a:graphic xmlns:a="http://schemas.openxmlformats.org/drawingml/2006/main">
-              <a:graphicData uri="http://schemas.openxmlformats.org/drawingml/2006/picture">
-                <pic:pic xmlns:pic="http://schemas.openxmlformats.org/drawingml/2006/picture">
-                  <pic:nvPicPr>
-                    <pic:cNvPr id="0" name=""/>
-                    <pic:cNvPicPr>
-                      <a:picLocks noChangeAspect="1" noChangeArrowheads="1"/>
-                    </pic:cNvPicPr>
-                  </pic:nvPicPr>
-                  <pic:blipFill>
-                    <a:blip r:embed="rId10"/>
-                    <a:srcRect/>
-                    <a:stretch>
-                      <a:fillRect/>
-                    </a:stretch>
-                  </pic:blipFill>
-                  <pic:spPr bwMode="auto">
-                    <a:xfrm>
-                      <a:off x="0" y="0"/>
-                      <a:ext cx="4572000" cy="1962150"/>
-                    </a:xfrm>
-                    <a:prstGeom prst="rect">
-                      <a:avLst/>
-                    </a:prstGeom>
-                  </pic:spPr>
-                </pic:pic>
-              </a:graphicData>
-            </a:graphic>
-          </wp:inline>
-        </w:drawing>
-      </w:r>
     </w:p>
     <w:p>
       <w:pPr>
@@ -13854,49 +13386,6 @@
         <w:spacing w:before="80" w:after="80"/>
         <w:jc w:val="center"/>
       </w:pPr>
-      <w:r>
-        <w:rPr>
-          <w:noProof/>
-        </w:rPr>
-        <w:drawing>
-          <wp:inline distT="0" distB="0" distL="0" distR="0" wp14:anchorId="2F4C735A" wp14:editId="22F2088E">
-            <wp:extent cx="4572000" cy="1571625"/>
-            <wp:effectExtent l="0" t="0" r="0" b="0"/>
-            <wp:docPr id="2135837670" name="diagram" descr="Path diagram" title="Diagram"/>
-            <wp:cNvGraphicFramePr>
-              <a:graphicFrameLocks xmlns:a="http://schemas.openxmlformats.org/drawingml/2006/main" noChangeAspect="1"/>
-            </wp:cNvGraphicFramePr>
-            <a:graphic xmlns:a="http://schemas.openxmlformats.org/drawingml/2006/main">
-              <a:graphicData uri="http://schemas.openxmlformats.org/drawingml/2006/picture">
-                <pic:pic xmlns:pic="http://schemas.openxmlformats.org/drawingml/2006/picture">
-                  <pic:nvPicPr>
-                    <pic:cNvPr id="0" name=""/>
-                    <pic:cNvPicPr>
-                      <a:picLocks noChangeAspect="1" noChangeArrowheads="1"/>
-                    </pic:cNvPicPr>
-                  </pic:nvPicPr>
-                  <pic:blipFill>
-                    <a:blip r:embed="rId9"/>
-                    <a:srcRect/>
-                    <a:stretch>
-                      <a:fillRect/>
-                    </a:stretch>
-                  </pic:blipFill>
-                  <pic:spPr bwMode="auto">
-                    <a:xfrm>
-                      <a:off x="0" y="0"/>
-                      <a:ext cx="4572000" cy="1571625"/>
-                    </a:xfrm>
-                    <a:prstGeom prst="rect">
-                      <a:avLst/>
-                    </a:prstGeom>
-                  </pic:spPr>
-                </pic:pic>
-              </a:graphicData>
-            </a:graphic>
-          </wp:inline>
-        </w:drawing>
-      </w:r>
     </w:p>
     <w:p>
       <w:pPr>
@@ -13935,49 +13424,6 @@
         <w:spacing w:before="80" w:after="80"/>
         <w:jc w:val="center"/>
       </w:pPr>
-      <w:r>
-        <w:rPr>
-          <w:noProof/>
-        </w:rPr>
-        <w:drawing>
-          <wp:inline distT="0" distB="0" distL="0" distR="0" wp14:anchorId="3A3F06A7" wp14:editId="1EEF110F">
-            <wp:extent cx="4572000" cy="1962150"/>
-            <wp:effectExtent l="0" t="0" r="0" b="0"/>
-            <wp:docPr id="1714133800" name="diagram" descr="Path diagram" title="Diagram"/>
-            <wp:cNvGraphicFramePr>
-              <a:graphicFrameLocks xmlns:a="http://schemas.openxmlformats.org/drawingml/2006/main" noChangeAspect="1"/>
-            </wp:cNvGraphicFramePr>
-            <a:graphic xmlns:a="http://schemas.openxmlformats.org/drawingml/2006/main">
-              <a:graphicData uri="http://schemas.openxmlformats.org/drawingml/2006/picture">
-                <pic:pic xmlns:pic="http://schemas.openxmlformats.org/drawingml/2006/picture">
-                  <pic:nvPicPr>
-                    <pic:cNvPr id="0" name=""/>
-                    <pic:cNvPicPr>
-                      <a:picLocks noChangeAspect="1" noChangeArrowheads="1"/>
-                    </pic:cNvPicPr>
-                  </pic:nvPicPr>
-                  <pic:blipFill>
-                    <a:blip r:embed="rId10"/>
-                    <a:srcRect/>
-                    <a:stretch>
-                      <a:fillRect/>
-                    </a:stretch>
-                  </pic:blipFill>
-                  <pic:spPr bwMode="auto">
-                    <a:xfrm>
-                      <a:off x="0" y="0"/>
-                      <a:ext cx="4572000" cy="1962150"/>
-                    </a:xfrm>
-                    <a:prstGeom prst="rect">
-                      <a:avLst/>
-                    </a:prstGeom>
-                  </pic:spPr>
-                </pic:pic>
-              </a:graphicData>
-            </a:graphic>
-          </wp:inline>
-        </w:drawing>
-      </w:r>
     </w:p>
     <w:p>
       <w:pPr>
@@ -15896,13 +15342,7 @@
       </w:pPr>
     </w:p>
     <w:p>
-      <w:r>
-        <w:br w:type="page"/>
-      </w:r>
-    </w:p>
-    <w:p>
-      <w:pPr>
-        <w:shd w:val="clear" w:color="auto" w:fill="1A2744"/>
+      <w:pPr>
         <w:spacing w:before="240"/>
         <w:jc w:val="center"/>
       </w:pPr>
@@ -15910,7 +15350,6 @@
         <w:rPr>
           <w:b/>
           <w:bCs/>
-          <w:color w:val="FFFFFF"/>
           <w:sz w:val="44"/>
           <w:szCs w:val="44"/>
         </w:rPr>
@@ -15919,7 +15358,6 @@
     </w:p>
     <w:p>
       <w:pPr>
-        <w:shd w:val="clear" w:color="auto" w:fill="1A2744"/>
         <w:spacing w:after="400"/>
         <w:jc w:val="center"/>
       </w:pPr>
@@ -15927,7 +15365,6 @@
         <w:rPr>
           <w:i/>
           <w:iCs/>
-          <w:color w:val="A8BCDB"/>
         </w:rPr>
         <w:t>Model Comparison &amp; Reporting Checklist</w:t>
       </w:r>

</xml_diff>